<commit_message>
docs(sem05): agregar entregables e informes de gestion scrum semana 5
</commit_message>
<xml_diff>
--- a/docs/entregables/SEM05/1_Acta de Aceptación de Entregables.docx
+++ b/docs/entregables/SEM05/1_Acta de Aceptación de Entregables.docx
@@ -1517,7 +1517,7 @@
                 <w:rFonts w:ascii="Calibri" w:hAnsi="Calibri"/>
                 <w:sz w:val="18"/>
               </w:rPr>
-              <w:t>Suite de 93 pruebas unitarias y de integración automatizadas en backend ejecutadas con pytest (0 fallos).</w:t>
+              <w:t>Batería integral de 374 pruebas automatizadas con 100% de éxito (0 fallos): 93 pruebas unitarias y de integración en backend con pytest/FastAPI y 281 pruebas unitarias en frontend con Vitest/Angular 21 (servicios, componentes y guards).</w:t>
             </w:r>
           </w:p>
           <w:p>
@@ -1538,7 +1538,7 @@
                 <w:rFonts w:ascii="Calibri" w:hAnsi="Calibri"/>
                 <w:sz w:val="18"/>
               </w:rPr>
-              <w:t>Compilación limpia del frontend en Angular 21 en 3.2 segundos sin errores de TypeScript ni estilos.</w:t>
+              <w:t>Pipeline de integración y despliegue continuo (CI/CD) automatizado en GitHub Actions ejecutando compilación y suites completas de pruebas ante cada Pull Request.</w:t>
             </w:r>
           </w:p>
           <w:p>
@@ -1559,7 +1559,7 @@
                 <w:rFonts w:ascii="Calibri" w:hAnsi="Calibri"/>
                 <w:sz w:val="18"/>
               </w:rPr>
-              <w:t>Demostración interactiva del software funcionando en vivo sobre entorno local Docker.</w:t>
+              <w:t>Demostración interactiva del software funcionando en vivo sobre entorno contenerizado con Docker Compose y respaldo en VPS propio.</w:t>
             </w:r>
           </w:p>
         </w:tc>

</xml_diff>